<commit_message>
V1.6.1: Comprehensive weekend update (Speech Coach, CRM, Audio)
- Speech Coach UX: Modernized Read Aloud mode feedback UI with a two-column compact layout.
- CRM Admin: Fixed header overflow, implemented bulk delete, and added recycle bin/link recovery features.
- PDF Export: Fixed html2pdf/jsPDF clipping and blurry rendering issues.
- Entrance Tests: Corrected scoring logic and added testing configurations.
- Audio Generation: Backfilled Beginner Mode (Speed 80) MP3s for RFIB.
- Council/Agent: Fixed High Council summoning script and accessibility bugs.
</commit_message>
<xml_diff>
--- a/public/database/Entrance Test/ENTRANCE TEST 36+ (Full Test).docx
+++ b/public/database/Entrance Test/ENTRANCE TEST 36+ (Full Test).docx
@@ -163,7 +163,28 @@
           <w:b/>
           <w:color w:val="00B050"/>
         </w:rPr>
-        <w:t>__insects/reptiles/mammals/primates__</w:t>
+        <w:t>__</w:t>
+      </w:r>
+      <w:r>
+        <w:rPr>
+          <w:b/>
+          <w:color w:val="00B050"/>
+        </w:rPr>
+        <w:t xml:space="preserve"> </w:t>
+      </w:r>
+      <w:r>
+        <w:rPr>
+          <w:b/>
+          <w:color w:val="00B050"/>
+        </w:rPr>
+        <w:t>reptiles/</w:t>
+      </w:r>
+      <w:r>
+        <w:rPr>
+          <w:b/>
+          <w:color w:val="00B050"/>
+        </w:rPr>
+        <w:t>insects/mammals/primates__</w:t>
       </w:r>
       <w:r>
         <w:rPr>
@@ -176,7 +197,28 @@
           <w:b/>
           <w:color w:val="00B050"/>
         </w:rPr>
-        <w:t>__habit/diet/tradition/plan__</w:t>
+        <w:t>__</w:t>
+      </w:r>
+      <w:r>
+        <w:rPr>
+          <w:b/>
+          <w:color w:val="00B050"/>
+        </w:rPr>
+        <w:t xml:space="preserve"> </w:t>
+      </w:r>
+      <w:r>
+        <w:rPr>
+          <w:b/>
+          <w:color w:val="00B050"/>
+        </w:rPr>
+        <w:t>diet/</w:t>
+      </w:r>
+      <w:r>
+        <w:rPr>
+          <w:b/>
+          <w:color w:val="00B050"/>
+        </w:rPr>
+        <w:t>habit/tradition/plan__</w:t>
       </w:r>
       <w:r>
         <w:rPr>
@@ -195,7 +237,28 @@
           <w:b/>
           <w:color w:val="00B050"/>
         </w:rPr>
-        <w:t>__hard/slow/easy/difficult__</w:t>
+        <w:t>__</w:t>
+      </w:r>
+      <w:r>
+        <w:rPr>
+          <w:b/>
+          <w:color w:val="00B050"/>
+        </w:rPr>
+        <w:t xml:space="preserve"> </w:t>
+      </w:r>
+      <w:r>
+        <w:rPr>
+          <w:b/>
+          <w:color w:val="00B050"/>
+        </w:rPr>
+        <w:t>easy/</w:t>
+      </w:r>
+      <w:r>
+        <w:rPr>
+          <w:b/>
+          <w:color w:val="00B050"/>
+        </w:rPr>
+        <w:t>hard/slow/difficult__</w:t>
       </w:r>
       <w:r>
         <w:rPr>
@@ -223,7 +286,28 @@
           <w:b/>
           <w:color w:val="00B050"/>
         </w:rPr>
-        <w:t>__eyes/lungs/throat/nose__</w:t>
+        <w:t>__</w:t>
+      </w:r>
+      <w:r>
+        <w:rPr>
+          <w:b/>
+          <w:color w:val="00B050"/>
+        </w:rPr>
+        <w:t xml:space="preserve"> </w:t>
+      </w:r>
+      <w:r>
+        <w:rPr>
+          <w:b/>
+          <w:color w:val="00B050"/>
+        </w:rPr>
+        <w:t>throat /</w:t>
+      </w:r>
+      <w:r>
+        <w:rPr>
+          <w:b/>
+          <w:color w:val="00B050"/>
+        </w:rPr>
+        <w:t>eyes/lungs/nose__</w:t>
       </w:r>
       <w:r>
         <w:rPr>
@@ -293,7 +377,42 @@
           <w:b/>
           <w:color w:val="00B050"/>
         </w:rPr>
-        <w:t xml:space="preserve">__importantly/critically/crucially/essentially__ </w:t>
+        <w:t>__</w:t>
+      </w:r>
+      <w:r>
+        <w:rPr>
+          <w:b/>
+          <w:color w:val="00B050"/>
+        </w:rPr>
+        <w:t xml:space="preserve"> </w:t>
+      </w:r>
+      <w:r>
+        <w:rPr>
+          <w:b/>
+          <w:color w:val="00B050"/>
+        </w:rPr>
+        <w:t>critically/</w:t>
+      </w:r>
+      <w:r>
+        <w:rPr>
+          <w:b/>
+          <w:color w:val="00B050"/>
+        </w:rPr>
+        <w:t>importantly</w:t>
+      </w:r>
+      <w:r>
+        <w:rPr>
+          <w:b/>
+          <w:color w:val="00B050"/>
+        </w:rPr>
+        <w:t>/</w:t>
+      </w:r>
+      <w:r>
+        <w:rPr>
+          <w:b/>
+          <w:color w:val="00B050"/>
+        </w:rPr>
+        <w:t xml:space="preserve">crucially/essentially__ </w:t>
       </w:r>
       <w:r>
         <w:rPr>
@@ -334,7 +453,28 @@
           <w:b/>
           <w:color w:val="00B050"/>
         </w:rPr>
-        <w:t>__reflect/remake/respond/reject__</w:t>
+        <w:t>__</w:t>
+      </w:r>
+      <w:r>
+        <w:rPr>
+          <w:b/>
+          <w:color w:val="00B050"/>
+        </w:rPr>
+        <w:t xml:space="preserve"> </w:t>
+      </w:r>
+      <w:r>
+        <w:rPr>
+          <w:b/>
+          <w:color w:val="00B050"/>
+        </w:rPr>
+        <w:t>reject/</w:t>
+      </w:r>
+      <w:r>
+        <w:rPr>
+          <w:b/>
+          <w:color w:val="00B050"/>
+        </w:rPr>
+        <w:t>reflect/remake/respond__</w:t>
       </w:r>
       <w:r>
         <w:rPr>
@@ -385,7 +525,28 @@
           <w:b/>
           <w:color w:val="00B050"/>
         </w:rPr>
-        <w:t>__mental/chemical/physical/spiritual__</w:t>
+        <w:t>__</w:t>
+      </w:r>
+      <w:r>
+        <w:rPr>
+          <w:b/>
+          <w:color w:val="00B050"/>
+        </w:rPr>
+        <w:t xml:space="preserve"> </w:t>
+      </w:r>
+      <w:r>
+        <w:rPr>
+          <w:b/>
+          <w:color w:val="00B050"/>
+        </w:rPr>
+        <w:t>physical/</w:t>
+      </w:r>
+      <w:r>
+        <w:rPr>
+          <w:b/>
+          <w:color w:val="00B050"/>
+        </w:rPr>
+        <w:t>mental/chemical/spiritual__</w:t>
       </w:r>
       <w:r>
         <w:rPr>
@@ -404,7 +565,42 @@
           <w:b/>
           <w:color w:val="00B050"/>
         </w:rPr>
-        <w:t>__appalling/appealing/attractive/appetizing __</w:t>
+        <w:t>__</w:t>
+      </w:r>
+      <w:r>
+        <w:rPr>
+          <w:b/>
+          <w:color w:val="00B050"/>
+        </w:rPr>
+        <w:t xml:space="preserve"> </w:t>
+      </w:r>
+      <w:r>
+        <w:rPr>
+          <w:b/>
+          <w:color w:val="00B050"/>
+        </w:rPr>
+        <w:t>appalling</w:t>
+      </w:r>
+      <w:r>
+        <w:rPr>
+          <w:b/>
+          <w:color w:val="00B050"/>
+        </w:rPr>
+        <w:t>/</w:t>
+      </w:r>
+      <w:r>
+        <w:rPr>
+          <w:b/>
+          <w:color w:val="00B050"/>
+        </w:rPr>
+        <w:t>appealing</w:t>
+      </w:r>
+      <w:r>
+        <w:rPr>
+          <w:b/>
+          <w:color w:val="00B050"/>
+        </w:rPr>
+        <w:t>/attractive/appetizing __</w:t>
       </w:r>
       <w:r>
         <w:rPr>
@@ -453,7 +649,42 @@
           <w:b/>
           <w:color w:val="00B050"/>
         </w:rPr>
-        <w:t>__acquired/extrinsic/intuitive/instinctive__</w:t>
+        <w:t>__</w:t>
+      </w:r>
+      <w:r>
+        <w:rPr>
+          <w:b/>
+          <w:color w:val="00B050"/>
+        </w:rPr>
+        <w:t xml:space="preserve"> </w:t>
+      </w:r>
+      <w:r>
+        <w:rPr>
+          <w:b/>
+          <w:color w:val="00B050"/>
+        </w:rPr>
+        <w:t>instinctive/</w:t>
+      </w:r>
+      <w:r>
+        <w:rPr>
+          <w:b/>
+          <w:color w:val="00B050"/>
+        </w:rPr>
+        <w:t>acquired/extrinsic/intuitive/</w:t>
+      </w:r>
+      <w:r>
+        <w:rPr>
+          <w:b/>
+          <w:color w:val="00B050"/>
+        </w:rPr>
+        <w:t xml:space="preserve"> </w:t>
+      </w:r>
+      <w:r>
+        <w:rPr>
+          <w:b/>
+          <w:color w:val="00B050"/>
+        </w:rPr>
+        <w:t>__</w:t>
       </w:r>
       <w:r>
         <w:rPr>
@@ -472,7 +703,28 @@
           <w:b/>
           <w:color w:val="00B050"/>
         </w:rPr>
-        <w:t>__effort/trial/attempt/encouragement__</w:t>
+        <w:t>__</w:t>
+      </w:r>
+      <w:r>
+        <w:rPr>
+          <w:b/>
+          <w:color w:val="00B050"/>
+        </w:rPr>
+        <w:t xml:space="preserve"> </w:t>
+      </w:r>
+      <w:r>
+        <w:rPr>
+          <w:b/>
+          <w:color w:val="00B050"/>
+        </w:rPr>
+        <w:t>trial/</w:t>
+      </w:r>
+      <w:r>
+        <w:rPr>
+          <w:b/>
+          <w:color w:val="00B050"/>
+        </w:rPr>
+        <w:t>effort/attempt/encouragement__</w:t>
       </w:r>
       <w:r>
         <w:rPr>
@@ -529,7 +781,28 @@
           <w:b/>
           <w:color w:val="00B050"/>
         </w:rPr>
-        <w:t>__building/hereditary/metabolic/ /nutritional__</w:t>
+        <w:t>__</w:t>
+      </w:r>
+      <w:r>
+        <w:rPr>
+          <w:b/>
+          <w:color w:val="00B050"/>
+        </w:rPr>
+        <w:t xml:space="preserve"> </w:t>
+      </w:r>
+      <w:r>
+        <w:rPr>
+          <w:b/>
+          <w:color w:val="00B050"/>
+        </w:rPr>
+        <w:t>hereditary/</w:t>
+      </w:r>
+      <w:r>
+        <w:rPr>
+          <w:b/>
+          <w:color w:val="00B050"/>
+        </w:rPr>
+        <w:t>building/metabolic/ /nutritional__</w:t>
       </w:r>
       <w:r>
         <w:rPr>
@@ -548,7 +821,28 @@
           <w:b/>
           <w:color w:val="00B050"/>
         </w:rPr>
-        <w:t>__out/down/around/by__</w:t>
+        <w:t>__</w:t>
+      </w:r>
+      <w:r>
+        <w:rPr>
+          <w:b/>
+          <w:color w:val="00B050"/>
+        </w:rPr>
+        <w:t xml:space="preserve"> </w:t>
+      </w:r>
+      <w:r>
+        <w:rPr>
+          <w:b/>
+          <w:color w:val="00B050"/>
+        </w:rPr>
+        <w:t>down/</w:t>
+      </w:r>
+      <w:r>
+        <w:rPr>
+          <w:b/>
+          <w:color w:val="00B050"/>
+        </w:rPr>
+        <w:t>out/around/by__</w:t>
       </w:r>
       <w:r>
         <w:rPr>
@@ -586,7 +880,42 @@
           <w:b/>
           <w:color w:val="00B050"/>
         </w:rPr>
-        <w:t>__hypothesis/statement/thesis/theory__</w:t>
+        <w:t>__</w:t>
+      </w:r>
+      <w:r>
+        <w:rPr>
+          <w:b/>
+          <w:color w:val="00B050"/>
+        </w:rPr>
+        <w:t xml:space="preserve"> </w:t>
+      </w:r>
+      <w:r>
+        <w:rPr>
+          <w:b/>
+          <w:color w:val="00B050"/>
+        </w:rPr>
+        <w:t>theory/</w:t>
+      </w:r>
+      <w:r>
+        <w:rPr>
+          <w:b/>
+          <w:color w:val="00B050"/>
+        </w:rPr>
+        <w:t>hypothesis/statement/thesis</w:t>
+      </w:r>
+      <w:r>
+        <w:rPr>
+          <w:b/>
+          <w:color w:val="00B050"/>
+        </w:rPr>
+        <w:t xml:space="preserve"> </w:t>
+      </w:r>
+      <w:r>
+        <w:rPr>
+          <w:b/>
+          <w:color w:val="00B050"/>
+        </w:rPr>
+        <w:t>__</w:t>
       </w:r>
       <w:r>
         <w:rPr>
@@ -663,7 +992,28 @@
           <w:b/>
           <w:color w:val="FF0000"/>
         </w:rPr>
-        <w:t>__design/designed/designing/designs__</w:t>
+        <w:t>__</w:t>
+      </w:r>
+      <w:r>
+        <w:rPr>
+          <w:b/>
+          <w:color w:val="FF0000"/>
+        </w:rPr>
+        <w:t xml:space="preserve"> </w:t>
+      </w:r>
+      <w:r>
+        <w:rPr>
+          <w:b/>
+          <w:color w:val="FF0000"/>
+        </w:rPr>
+        <w:t>designed/</w:t>
+      </w:r>
+      <w:r>
+        <w:rPr>
+          <w:b/>
+          <w:color w:val="FF0000"/>
+        </w:rPr>
+        <w:t>design/designing/designs__</w:t>
       </w:r>
       <w:r>
         <w:rPr>
@@ -709,7 +1059,21 @@
           <w:b/>
           <w:color w:val="FF0000"/>
         </w:rPr>
-        <w:t>__ what/who/which/why__</w:t>
+        <w:t xml:space="preserve">__ </w:t>
+      </w:r>
+      <w:r>
+        <w:rPr>
+          <w:b/>
+          <w:color w:val="FF0000"/>
+        </w:rPr>
+        <w:t>which/</w:t>
+      </w:r>
+      <w:r>
+        <w:rPr>
+          <w:b/>
+          <w:color w:val="FF0000"/>
+        </w:rPr>
+        <w:t>what/who/why__</w:t>
       </w:r>
       <w:r>
         <w:rPr>
@@ -722,7 +1086,28 @@
           <w:b/>
           <w:color w:val="FF0000"/>
         </w:rPr>
-        <w:t>__interests/interest/interesting/interestingly__</w:t>
+        <w:t>__</w:t>
+      </w:r>
+      <w:r>
+        <w:rPr>
+          <w:b/>
+          <w:color w:val="FF0000"/>
+        </w:rPr>
+        <w:t xml:space="preserve"> </w:t>
+      </w:r>
+      <w:r>
+        <w:rPr>
+          <w:b/>
+          <w:color w:val="FF0000"/>
+        </w:rPr>
+        <w:t>interest/</w:t>
+      </w:r>
+      <w:r>
+        <w:rPr>
+          <w:b/>
+          <w:color w:val="FF0000"/>
+        </w:rPr>
+        <w:t>interests/interesting/interestingly__</w:t>
       </w:r>
       <w:r>
         <w:rPr>
@@ -754,7 +1139,28 @@
           <w:b/>
           <w:color w:val="FF0000"/>
         </w:rPr>
-        <w:t>__on/around/in/to__</w:t>
+        <w:t>__</w:t>
+      </w:r>
+      <w:r>
+        <w:rPr>
+          <w:b/>
+          <w:color w:val="FF0000"/>
+        </w:rPr>
+        <w:t xml:space="preserve"> </w:t>
+      </w:r>
+      <w:r>
+        <w:rPr>
+          <w:b/>
+          <w:color w:val="FF0000"/>
+        </w:rPr>
+        <w:t>in/</w:t>
+      </w:r>
+      <w:r>
+        <w:rPr>
+          <w:b/>
+          <w:color w:val="FF0000"/>
+        </w:rPr>
+        <w:t>on/around/to__</w:t>
       </w:r>
       <w:r>
         <w:rPr>
@@ -873,7 +1279,28 @@
           <w:b/>
           <w:color w:val="FF0000"/>
         </w:rPr>
-        <w:t>__individuals/individualized/individual/individually__,</w:t>
+        <w:t>__</w:t>
+      </w:r>
+      <w:r>
+        <w:rPr>
+          <w:b/>
+          <w:color w:val="FF0000"/>
+        </w:rPr>
+        <w:t xml:space="preserve"> </w:t>
+      </w:r>
+      <w:r>
+        <w:rPr>
+          <w:b/>
+          <w:color w:val="FF0000"/>
+        </w:rPr>
+        <w:t>individually/</w:t>
+      </w:r>
+      <w:r>
+        <w:rPr>
+          <w:b/>
+          <w:color w:val="FF0000"/>
+        </w:rPr>
+        <w:t>individuals/individualized/individual__,</w:t>
       </w:r>
       <w:r>
         <w:rPr>
@@ -886,7 +1313,28 @@
           <w:b/>
           <w:color w:val="FF0000"/>
         </w:rPr>
-        <w:t>__what/which/who/where__</w:t>
+        <w:t>__</w:t>
+      </w:r>
+      <w:r>
+        <w:rPr>
+          <w:b/>
+          <w:color w:val="FF0000"/>
+        </w:rPr>
+        <w:t xml:space="preserve"> </w:t>
+      </w:r>
+      <w:r>
+        <w:rPr>
+          <w:b/>
+          <w:color w:val="FF0000"/>
+        </w:rPr>
+        <w:t>which/</w:t>
+      </w:r>
+      <w:r>
+        <w:rPr>
+          <w:b/>
+          <w:color w:val="FF0000"/>
+        </w:rPr>
+        <w:t>what/who/where__</w:t>
       </w:r>
       <w:r>
         <w:rPr>
@@ -932,7 +1380,28 @@
           <w:b/>
           <w:color w:val="FF0000"/>
         </w:rPr>
-        <w:t>__and/so/because/however__</w:t>
+        <w:t>__</w:t>
+      </w:r>
+      <w:r>
+        <w:rPr>
+          <w:b/>
+          <w:color w:val="FF0000"/>
+        </w:rPr>
+        <w:t xml:space="preserve"> </w:t>
+      </w:r>
+      <w:r>
+        <w:rPr>
+          <w:b/>
+          <w:color w:val="FF0000"/>
+        </w:rPr>
+        <w:t>because/</w:t>
+      </w:r>
+      <w:r>
+        <w:rPr>
+          <w:b/>
+          <w:color w:val="FF0000"/>
+        </w:rPr>
+        <w:t>and/so/however__</w:t>
       </w:r>
       <w:r>
         <w:rPr>
@@ -1001,7 +1470,28 @@
           <w:b/>
           <w:color w:val="FF0000"/>
         </w:rPr>
-        <w:t>__biology/biologically/biologist/biological__</w:t>
+        <w:t>__</w:t>
+      </w:r>
+      <w:r>
+        <w:rPr>
+          <w:b/>
+          <w:color w:val="FF0000"/>
+        </w:rPr>
+        <w:t xml:space="preserve"> </w:t>
+      </w:r>
+      <w:r>
+        <w:rPr>
+          <w:b/>
+          <w:color w:val="FF0000"/>
+        </w:rPr>
+        <w:t>biological/</w:t>
+      </w:r>
+      <w:r>
+        <w:rPr>
+          <w:b/>
+          <w:color w:val="FF0000"/>
+        </w:rPr>
+        <w:t>biology/biologically/biologist__</w:t>
       </w:r>
       <w:r>
         <w:rPr>
@@ -1025,7 +1515,28 @@
           <w:b/>
           <w:color w:val="FF0000"/>
         </w:rPr>
-        <w:t>__play/will play/played/have played__</w:t>
+        <w:t>__</w:t>
+      </w:r>
+      <w:r>
+        <w:rPr>
+          <w:b/>
+          <w:color w:val="FF0000"/>
+        </w:rPr>
+        <w:t xml:space="preserve"> </w:t>
+      </w:r>
+      <w:r>
+        <w:rPr>
+          <w:b/>
+          <w:color w:val="FF0000"/>
+        </w:rPr>
+        <w:t>played/</w:t>
+      </w:r>
+      <w:r>
+        <w:rPr>
+          <w:b/>
+          <w:color w:val="FF0000"/>
+        </w:rPr>
+        <w:t>play/will play/have played__</w:t>
       </w:r>
       <w:r>
         <w:rPr>
@@ -1073,7 +1584,28 @@
           <w:b/>
           <w:color w:val="FF0000"/>
         </w:rPr>
-        <w:t>__will make/have made/made/has made__</w:t>
+        <w:t>__</w:t>
+      </w:r>
+      <w:r>
+        <w:rPr>
+          <w:b/>
+          <w:color w:val="FF0000"/>
+        </w:rPr>
+        <w:t xml:space="preserve"> </w:t>
+      </w:r>
+      <w:r>
+        <w:rPr>
+          <w:b/>
+          <w:color w:val="FF0000"/>
+        </w:rPr>
+        <w:t>have made/</w:t>
+      </w:r>
+      <w:r>
+        <w:rPr>
+          <w:b/>
+          <w:color w:val="FF0000"/>
+        </w:rPr>
+        <w:t>will make/made/has made__</w:t>
       </w:r>
       <w:r>
         <w:rPr>

</xml_diff>